<commit_message>
Cập nhật README (checklist) và viết lại mã giả trong Design theo cú pháp C++
</commit_message>
<xml_diff>
--- a/docs/Design.docx
+++ b/docs/Design.docx
@@ -338,7 +338,7 @@
             </w:rPr>
             <w:fldChar w:fldCharType="separate"/>
           </w:r>
-          <w:hyperlink w:anchor="__RefHeading___Toc3271_1357861495">
+          <w:hyperlink w:anchor="__RefHeading___Toc3399_2610765929">
             <w:r>
               <w:rPr>
                 <w:webHidden/>
@@ -365,7 +365,7 @@
             </w:tabs>
             <w:rPr/>
           </w:pPr>
-          <w:hyperlink w:anchor="__RefHeading___Toc3273_1357861495">
+          <w:hyperlink w:anchor="__RefHeading___Toc3401_2610765929">
             <w:r>
               <w:rPr>
                 <w:webHidden/>
@@ -392,7 +392,7 @@
             </w:tabs>
             <w:rPr/>
           </w:pPr>
-          <w:hyperlink w:anchor="__RefHeading___Toc3275_1357861495">
+          <w:hyperlink w:anchor="__RefHeading___Toc3403_2610765929">
             <w:r>
               <w:rPr>
                 <w:webHidden/>
@@ -419,7 +419,7 @@
             </w:tabs>
             <w:rPr/>
           </w:pPr>
-          <w:hyperlink w:anchor="__RefHeading___Toc3277_1357861495">
+          <w:hyperlink w:anchor="__RefHeading___Toc3405_2610765929">
             <w:r>
               <w:rPr>
                 <w:webHidden/>
@@ -442,7 +442,7 @@
             <w:pStyle w:val="Contents1"/>
             <w:rPr/>
           </w:pPr>
-          <w:hyperlink w:anchor="__RefHeading___Toc3279_1357861495">
+          <w:hyperlink w:anchor="__RefHeading___Toc3407_2610765929">
             <w:r>
               <w:rPr>
                 <w:webHidden/>
@@ -469,7 +469,7 @@
             </w:tabs>
             <w:rPr/>
           </w:pPr>
-          <w:hyperlink w:anchor="__RefHeading___Toc3281_1357861495">
+          <w:hyperlink w:anchor="__RefHeading___Toc3409_2610765929">
             <w:r>
               <w:rPr>
                 <w:webHidden/>
@@ -496,7 +496,7 @@
             </w:tabs>
             <w:rPr/>
           </w:pPr>
-          <w:hyperlink w:anchor="__RefHeading___Toc3283_1357861495">
+          <w:hyperlink w:anchor="__RefHeading___Toc3411_2610765929">
             <w:r>
               <w:rPr>
                 <w:webHidden/>
@@ -523,7 +523,7 @@
             </w:tabs>
             <w:rPr/>
           </w:pPr>
-          <w:hyperlink w:anchor="__RefHeading___Toc3285_1357861495">
+          <w:hyperlink w:anchor="__RefHeading___Toc3413_2610765929">
             <w:r>
               <w:rPr>
                 <w:webHidden/>
@@ -546,7 +546,7 @@
             <w:pStyle w:val="Contents1"/>
             <w:rPr/>
           </w:pPr>
-          <w:hyperlink w:anchor="__RefHeading___Toc3287_1357861495">
+          <w:hyperlink w:anchor="__RefHeading___Toc3415_2610765929">
             <w:r>
               <w:rPr>
                 <w:webHidden/>
@@ -573,7 +573,7 @@
             </w:tabs>
             <w:rPr/>
           </w:pPr>
-          <w:hyperlink w:anchor="__RefHeading___Toc3289_1357861495">
+          <w:hyperlink w:anchor="__RefHeading___Toc3417_2610765929">
             <w:r>
               <w:rPr>
                 <w:webHidden/>
@@ -600,7 +600,7 @@
             </w:tabs>
             <w:rPr/>
           </w:pPr>
-          <w:hyperlink w:anchor="__RefHeading___Toc3291_1357861495">
+          <w:hyperlink w:anchor="__RefHeading___Toc3419_2610765929">
             <w:r>
               <w:rPr>
                 <w:webHidden/>
@@ -627,7 +627,7 @@
             </w:tabs>
             <w:rPr/>
           </w:pPr>
-          <w:hyperlink w:anchor="__RefHeading___Toc3293_1357861495">
+          <w:hyperlink w:anchor="__RefHeading___Toc3421_2610765929">
             <w:r>
               <w:rPr>
                 <w:webHidden/>
@@ -654,7 +654,7 @@
             </w:tabs>
             <w:rPr/>
           </w:pPr>
-          <w:hyperlink w:anchor="__RefHeading___Toc3295_1357861495">
+          <w:hyperlink w:anchor="__RefHeading___Toc3423_2610765929">
             <w:r>
               <w:rPr>
                 <w:webHidden/>
@@ -677,7 +677,7 @@
             <w:pStyle w:val="Contents1"/>
             <w:rPr/>
           </w:pPr>
-          <w:hyperlink w:anchor="__RefHeading___Toc3297_1357861495">
+          <w:hyperlink w:anchor="__RefHeading___Toc3425_2610765929">
             <w:r>
               <w:rPr>
                 <w:webHidden/>
@@ -704,7 +704,7 @@
             </w:tabs>
             <w:rPr/>
           </w:pPr>
-          <w:hyperlink w:anchor="__RefHeading___Toc3299_1357861495">
+          <w:hyperlink w:anchor="__RefHeading___Toc3427_2610765929">
             <w:r>
               <w:rPr>
                 <w:webHidden/>
@@ -731,7 +731,7 @@
             </w:tabs>
             <w:rPr/>
           </w:pPr>
-          <w:hyperlink w:anchor="__RefHeading___Toc3301_1357861495">
+          <w:hyperlink w:anchor="__RefHeading___Toc3429_2610765929">
             <w:r>
               <w:rPr>
                 <w:webHidden/>
@@ -758,7 +758,7 @@
             </w:tabs>
             <w:rPr/>
           </w:pPr>
-          <w:hyperlink w:anchor="__RefHeading___Toc3303_1357861495">
+          <w:hyperlink w:anchor="__RefHeading___Toc3431_2610765929">
             <w:r>
               <w:rPr>
                 <w:webHidden/>
@@ -785,7 +785,7 @@
             </w:tabs>
             <w:rPr/>
           </w:pPr>
-          <w:hyperlink w:anchor="__RefHeading___Toc3305_1357861495">
+          <w:hyperlink w:anchor="__RefHeading___Toc3433_2610765929">
             <w:r>
               <w:rPr>
                 <w:webHidden/>
@@ -812,7 +812,7 @@
             </w:tabs>
             <w:rPr/>
           </w:pPr>
-          <w:hyperlink w:anchor="__RefHeading___Toc3307_1357861495">
+          <w:hyperlink w:anchor="__RefHeading___Toc3435_2610765929">
             <w:r>
               <w:rPr>
                 <w:webHidden/>
@@ -839,7 +839,7 @@
             </w:tabs>
             <w:rPr/>
           </w:pPr>
-          <w:hyperlink w:anchor="__RefHeading___Toc3309_1357861495">
+          <w:hyperlink w:anchor="__RefHeading___Toc3437_2610765929">
             <w:r>
               <w:rPr>
                 <w:webHidden/>
@@ -866,7 +866,7 @@
             </w:tabs>
             <w:rPr/>
           </w:pPr>
-          <w:hyperlink w:anchor="__RefHeading___Toc3311_1357861495">
+          <w:hyperlink w:anchor="__RefHeading___Toc3439_2610765929">
             <w:r>
               <w:rPr>
                 <w:webHidden/>
@@ -893,7 +893,7 @@
             </w:tabs>
             <w:rPr/>
           </w:pPr>
-          <w:hyperlink w:anchor="__RefHeading___Toc3313_1357861495">
+          <w:hyperlink w:anchor="__RefHeading___Toc3441_2610765929">
             <w:r>
               <w:rPr>
                 <w:webHidden/>
@@ -916,7 +916,7 @@
             <w:pStyle w:val="Contents1"/>
             <w:rPr/>
           </w:pPr>
-          <w:hyperlink w:anchor="__RefHeading___Toc3315_1357861495">
+          <w:hyperlink w:anchor="__RefHeading___Toc3443_2610765929">
             <w:r>
               <w:rPr>
                 <w:webHidden/>
@@ -943,7 +943,7 @@
             </w:tabs>
             <w:rPr/>
           </w:pPr>
-          <w:hyperlink w:anchor="__RefHeading___Toc3317_1357861495">
+          <w:hyperlink w:anchor="__RefHeading___Toc3445_2610765929">
             <w:r>
               <w:rPr>
                 <w:webHidden/>
@@ -970,7 +970,7 @@
             </w:tabs>
             <w:rPr/>
           </w:pPr>
-          <w:hyperlink w:anchor="__RefHeading___Toc3319_1357861495">
+          <w:hyperlink w:anchor="__RefHeading___Toc3447_2610765929">
             <w:r>
               <w:rPr>
                 <w:webHidden/>
@@ -997,7 +997,7 @@
             </w:tabs>
             <w:rPr/>
           </w:pPr>
-          <w:hyperlink w:anchor="__RefHeading___Toc3321_1357861495">
+          <w:hyperlink w:anchor="__RefHeading___Toc3449_2610765929">
             <w:r>
               <w:rPr>
                 <w:webHidden/>
@@ -1024,7 +1024,7 @@
             </w:tabs>
             <w:rPr/>
           </w:pPr>
-          <w:hyperlink w:anchor="__RefHeading___Toc3323_1357861495">
+          <w:hyperlink w:anchor="__RefHeading___Toc3451_2610765929">
             <w:r>
               <w:rPr>
                 <w:webHidden/>
@@ -1047,7 +1047,7 @@
             <w:pStyle w:val="Contents1"/>
             <w:rPr/>
           </w:pPr>
-          <w:hyperlink w:anchor="__RefHeading___Toc3325_1357861495">
+          <w:hyperlink w:anchor="__RefHeading___Toc3453_2610765929">
             <w:r>
               <w:rPr>
                 <w:webHidden/>
@@ -1074,7 +1074,7 @@
             </w:tabs>
             <w:rPr/>
           </w:pPr>
-          <w:hyperlink w:anchor="__RefHeading___Toc3327_1357861495">
+          <w:hyperlink w:anchor="__RefHeading___Toc3455_2610765929">
             <w:r>
               <w:rPr>
                 <w:webHidden/>
@@ -1101,7 +1101,7 @@
             </w:tabs>
             <w:rPr/>
           </w:pPr>
-          <w:hyperlink w:anchor="__RefHeading___Toc3329_1357861495">
+          <w:hyperlink w:anchor="__RefHeading___Toc3457_2610765929">
             <w:r>
               <w:rPr>
                 <w:webHidden/>
@@ -1124,7 +1124,7 @@
             <w:pStyle w:val="Contents1"/>
             <w:rPr/>
           </w:pPr>
-          <w:hyperlink w:anchor="__RefHeading___Toc3331_1357861495">
+          <w:hyperlink w:anchor="__RefHeading___Toc3459_2610765929">
             <w:r>
               <w:rPr>
                 <w:webHidden/>
@@ -1151,7 +1151,7 @@
             </w:tabs>
             <w:rPr/>
           </w:pPr>
-          <w:hyperlink w:anchor="__RefHeading___Toc3333_1357861495">
+          <w:hyperlink w:anchor="__RefHeading___Toc3461_2610765929">
             <w:r>
               <w:rPr>
                 <w:webHidden/>
@@ -1178,7 +1178,7 @@
             </w:tabs>
             <w:rPr/>
           </w:pPr>
-          <w:hyperlink w:anchor="__RefHeading___Toc3335_1357861495">
+          <w:hyperlink w:anchor="__RefHeading___Toc3463_2610765929">
             <w:r>
               <w:rPr>
                 <w:webHidden/>
@@ -1205,7 +1205,7 @@
             </w:tabs>
             <w:rPr/>
           </w:pPr>
-          <w:hyperlink w:anchor="__RefHeading___Toc3337_1357861495">
+          <w:hyperlink w:anchor="__RefHeading___Toc3465_2610765929">
             <w:r>
               <w:rPr>
                 <w:webHidden/>
@@ -1232,7 +1232,7 @@
             </w:tabs>
             <w:rPr/>
           </w:pPr>
-          <w:hyperlink w:anchor="__RefHeading___Toc3339_1357861495">
+          <w:hyperlink w:anchor="__RefHeading___Toc3467_2610765929">
             <w:r>
               <w:rPr>
                 <w:webHidden/>
@@ -1259,7 +1259,7 @@
             </w:tabs>
             <w:rPr/>
           </w:pPr>
-          <w:hyperlink w:anchor="__RefHeading___Toc3341_1357861495">
+          <w:hyperlink w:anchor="__RefHeading___Toc3469_2610765929">
             <w:r>
               <w:rPr>
                 <w:webHidden/>
@@ -1286,7 +1286,7 @@
             </w:tabs>
             <w:rPr/>
           </w:pPr>
-          <w:hyperlink w:anchor="__RefHeading___Toc3343_1357861495">
+          <w:hyperlink w:anchor="__RefHeading___Toc3471_2610765929">
             <w:r>
               <w:rPr>
                 <w:webHidden/>
@@ -1313,7 +1313,7 @@
             </w:tabs>
             <w:rPr/>
           </w:pPr>
-          <w:hyperlink w:anchor="__RefHeading___Toc3345_1357861495">
+          <w:hyperlink w:anchor="__RefHeading___Toc3473_2610765929">
             <w:r>
               <w:rPr>
                 <w:webHidden/>
@@ -1336,14 +1336,14 @@
             <w:pStyle w:val="Contents1"/>
             <w:rPr/>
           </w:pPr>
-          <w:hyperlink w:anchor="__RefHeading___Toc3347_1357861495">
+          <w:hyperlink w:anchor="__RefHeading___Toc3475_2610765929">
             <w:r>
               <w:rPr>
                 <w:webHidden/>
                 <w:rStyle w:val="IndexLink"/>
                 <w:i w:val="false"/>
               </w:rPr>
-              <w:t>CHƯƠNG 8. THIẾT KẾ GIẢI THUẬT CHÍNH (MÃ GIẢ)</w:t>
+              <w:t>CHƯƠNG 8. THIẾT KẾ GIẢI THUẬT CHÍNH (MÃ GIẢ C++)</w:t>
             </w:r>
             <w:r>
               <w:rPr>
@@ -1363,7 +1363,7 @@
             </w:tabs>
             <w:rPr/>
           </w:pPr>
-          <w:hyperlink w:anchor="__RefHeading___Toc3349_1357861495">
+          <w:hyperlink w:anchor="__RefHeading___Toc3477_2610765929">
             <w:r>
               <w:rPr>
                 <w:webHidden/>
@@ -1390,7 +1390,7 @@
             </w:tabs>
             <w:rPr/>
           </w:pPr>
-          <w:hyperlink w:anchor="__RefHeading___Toc3351_1357861495">
+          <w:hyperlink w:anchor="__RefHeading___Toc3479_2610765929">
             <w:r>
               <w:rPr>
                 <w:webHidden/>
@@ -1404,7 +1404,7 @@
                 <w:rStyle w:val="IndexLink"/>
               </w:rPr>
               <w:tab/>
-              <w:t>31</w:t>
+              <w:t>32</w:t>
             </w:r>
           </w:hyperlink>
         </w:p>
@@ -1417,7 +1417,7 @@
             </w:tabs>
             <w:rPr/>
           </w:pPr>
-          <w:hyperlink w:anchor="__RefHeading___Toc3353_1357861495">
+          <w:hyperlink w:anchor="__RefHeading___Toc3481_2610765929">
             <w:r>
               <w:rPr>
                 <w:webHidden/>
@@ -1444,7 +1444,7 @@
             </w:tabs>
             <w:rPr/>
           </w:pPr>
-          <w:hyperlink w:anchor="__RefHeading___Toc3355_1357861495">
+          <w:hyperlink w:anchor="__RefHeading___Toc3483_2610765929">
             <w:r>
               <w:rPr>
                 <w:webHidden/>
@@ -1471,7 +1471,7 @@
             </w:tabs>
             <w:rPr/>
           </w:pPr>
-          <w:hyperlink w:anchor="__RefHeading___Toc3357_1357861495">
+          <w:hyperlink w:anchor="__RefHeading___Toc3485_2610765929">
             <w:r>
               <w:rPr>
                 <w:webHidden/>
@@ -1485,7 +1485,7 @@
                 <w:rStyle w:val="IndexLink"/>
               </w:rPr>
               <w:tab/>
-              <w:t>32</w:t>
+              <w:t>33</w:t>
             </w:r>
           </w:hyperlink>
         </w:p>
@@ -1498,7 +1498,7 @@
             </w:tabs>
             <w:rPr/>
           </w:pPr>
-          <w:hyperlink w:anchor="__RefHeading___Toc3359_1357861495">
+          <w:hyperlink w:anchor="__RefHeading___Toc3487_2610765929">
             <w:r>
               <w:rPr>
                 <w:webHidden/>
@@ -1512,7 +1512,7 @@
                 <w:rStyle w:val="IndexLink"/>
               </w:rPr>
               <w:tab/>
-              <w:t>32</w:t>
+              <w:t>33</w:t>
             </w:r>
           </w:hyperlink>
         </w:p>
@@ -1521,7 +1521,7 @@
             <w:pStyle w:val="Contents1"/>
             <w:rPr/>
           </w:pPr>
-          <w:hyperlink w:anchor="__RefHeading___Toc3361_1357861495">
+          <w:hyperlink w:anchor="__RefHeading___Toc3489_2610765929">
             <w:r>
               <w:rPr>
                 <w:webHidden/>
@@ -1535,7 +1535,7 @@
                 <w:rStyle w:val="IndexLink"/>
               </w:rPr>
               <w:tab/>
-              <w:t>33</w:t>
+              <w:t>34</w:t>
             </w:r>
           </w:hyperlink>
         </w:p>
@@ -1548,7 +1548,7 @@
             </w:tabs>
             <w:rPr/>
           </w:pPr>
-          <w:hyperlink w:anchor="__RefHeading___Toc3363_1357861495">
+          <w:hyperlink w:anchor="__RefHeading___Toc3491_2610765929">
             <w:r>
               <w:rPr>
                 <w:webHidden/>
@@ -1562,7 +1562,7 @@
                 <w:rStyle w:val="IndexLink"/>
               </w:rPr>
               <w:tab/>
-              <w:t>33</w:t>
+              <w:t>34</w:t>
             </w:r>
           </w:hyperlink>
         </w:p>
@@ -1575,7 +1575,7 @@
             </w:tabs>
             <w:rPr/>
           </w:pPr>
-          <w:hyperlink w:anchor="__RefHeading___Toc3365_1357861495">
+          <w:hyperlink w:anchor="__RefHeading___Toc3493_2610765929">
             <w:r>
               <w:rPr>
                 <w:webHidden/>
@@ -1589,7 +1589,7 @@
                 <w:rStyle w:val="IndexLink"/>
               </w:rPr>
               <w:tab/>
-              <w:t>33</w:t>
+              <w:t>34</w:t>
             </w:r>
           </w:hyperlink>
         </w:p>
@@ -1598,7 +1598,7 @@
             <w:pStyle w:val="Contents1"/>
             <w:rPr/>
           </w:pPr>
-          <w:hyperlink w:anchor="__RefHeading___Toc3367_1357861495">
+          <w:hyperlink w:anchor="__RefHeading___Toc3495_2610765929">
             <w:r>
               <w:rPr>
                 <w:webHidden/>
@@ -1612,7 +1612,7 @@
                 <w:rStyle w:val="IndexLink"/>
               </w:rPr>
               <w:tab/>
-              <w:t>35</w:t>
+              <w:t>36</w:t>
             </w:r>
           </w:hyperlink>
         </w:p>
@@ -1625,7 +1625,7 @@
             </w:tabs>
             <w:rPr/>
           </w:pPr>
-          <w:hyperlink w:anchor="__RefHeading___Toc3369_1357861495">
+          <w:hyperlink w:anchor="__RefHeading___Toc3497_2610765929">
             <w:r>
               <w:rPr>
                 <w:webHidden/>
@@ -1639,7 +1639,7 @@
                 <w:rStyle w:val="IndexLink"/>
               </w:rPr>
               <w:tab/>
-              <w:t>35</w:t>
+              <w:t>36</w:t>
             </w:r>
           </w:hyperlink>
         </w:p>
@@ -1648,7 +1648,7 @@
             <w:pStyle w:val="Contents1"/>
             <w:rPr/>
           </w:pPr>
-          <w:hyperlink w:anchor="__RefHeading___Toc3371_1357861495">
+          <w:hyperlink w:anchor="__RefHeading___Toc3499_2610765929">
             <w:r>
               <w:rPr>
                 <w:webHidden/>
@@ -1662,7 +1662,7 @@
                 <w:rStyle w:val="IndexLink"/>
               </w:rPr>
               <w:tab/>
-              <w:t>36</w:t>
+              <w:t>37</w:t>
             </w:r>
           </w:hyperlink>
         </w:p>
@@ -1675,7 +1675,7 @@
             </w:tabs>
             <w:rPr/>
           </w:pPr>
-          <w:hyperlink w:anchor="__RefHeading___Toc3373_1357861495">
+          <w:hyperlink w:anchor="__RefHeading___Toc3501_2610765929">
             <w:r>
               <w:rPr>
                 <w:webHidden/>
@@ -1689,7 +1689,7 @@
                 <w:rStyle w:val="IndexLink"/>
               </w:rPr>
               <w:tab/>
-              <w:t>36</w:t>
+              <w:t>37</w:t>
             </w:r>
           </w:hyperlink>
         </w:p>
@@ -1702,7 +1702,7 @@
             </w:tabs>
             <w:rPr/>
           </w:pPr>
-          <w:hyperlink w:anchor="__RefHeading___Toc3375_1357861495">
+          <w:hyperlink w:anchor="__RefHeading___Toc3503_2610765929">
             <w:r>
               <w:rPr>
                 <w:webHidden/>
@@ -1716,7 +1716,7 @@
                 <w:rStyle w:val="IndexLink"/>
               </w:rPr>
               <w:tab/>
-              <w:t>36</w:t>
+              <w:t>37</w:t>
             </w:r>
           </w:hyperlink>
           <w:r>
@@ -1799,7 +1799,7 @@
             </w:rPr>
             <w:fldChar w:fldCharType="separate"/>
           </w:r>
-          <w:hyperlink w:anchor="__RefHeading___Toc3377_1357861495">
+          <w:hyperlink w:anchor="__RefHeading___Toc3505_2610765929">
             <w:r>
               <w:rPr>
                 <w:webHidden/>
@@ -1822,7 +1822,7 @@
             <w:pStyle w:val="Contents1"/>
             <w:rPr/>
           </w:pPr>
-          <w:hyperlink w:anchor="__RefHeading___Toc3415_1357861495">
+          <w:hyperlink w:anchor="__RefHeading___Toc3543_2610765929">
             <w:r>
               <w:rPr>
                 <w:webHidden/>
@@ -1845,7 +1845,7 @@
             <w:pStyle w:val="Contents1"/>
             <w:rPr/>
           </w:pPr>
-          <w:hyperlink w:anchor="__RefHeading___Toc3413_1357861495">
+          <w:hyperlink w:anchor="__RefHeading___Toc3541_2610765929">
             <w:r>
               <w:rPr>
                 <w:webHidden/>
@@ -1868,7 +1868,7 @@
             <w:pStyle w:val="Contents1"/>
             <w:rPr/>
           </w:pPr>
-          <w:hyperlink w:anchor="__RefHeading___Toc3411_1357861495">
+          <w:hyperlink w:anchor="__RefHeading___Toc3539_2610765929">
             <w:r>
               <w:rPr>
                 <w:webHidden/>
@@ -1891,7 +1891,7 @@
             <w:pStyle w:val="Contents1"/>
             <w:rPr/>
           </w:pPr>
-          <w:hyperlink w:anchor="__RefHeading___Toc3409_1357861495">
+          <w:hyperlink w:anchor="__RefHeading___Toc3537_2610765929">
             <w:r>
               <w:rPr>
                 <w:webHidden/>
@@ -1914,7 +1914,7 @@
             <w:pStyle w:val="Contents1"/>
             <w:rPr/>
           </w:pPr>
-          <w:hyperlink w:anchor="__RefHeading___Toc3407_1357861495">
+          <w:hyperlink w:anchor="__RefHeading___Toc3535_2610765929">
             <w:r>
               <w:rPr>
                 <w:webHidden/>
@@ -1937,7 +1937,7 @@
             <w:pStyle w:val="Contents1"/>
             <w:rPr/>
           </w:pPr>
-          <w:hyperlink w:anchor="__RefHeading___Toc3405_1357861495">
+          <w:hyperlink w:anchor="__RefHeading___Toc3533_2610765929">
             <w:r>
               <w:rPr>
                 <w:webHidden/>
@@ -1960,7 +1960,7 @@
             <w:pStyle w:val="Contents1"/>
             <w:rPr/>
           </w:pPr>
-          <w:hyperlink w:anchor="__RefHeading___Toc3403_1357861495">
+          <w:hyperlink w:anchor="__RefHeading___Toc3531_2610765929">
             <w:r>
               <w:rPr>
                 <w:webHidden/>
@@ -1983,7 +1983,7 @@
             <w:pStyle w:val="Contents1"/>
             <w:rPr/>
           </w:pPr>
-          <w:hyperlink w:anchor="__RefHeading___Toc3401_1357861495">
+          <w:hyperlink w:anchor="__RefHeading___Toc3529_2610765929">
             <w:r>
               <w:rPr>
                 <w:webHidden/>
@@ -2006,7 +2006,7 @@
             <w:pStyle w:val="Contents1"/>
             <w:rPr/>
           </w:pPr>
-          <w:hyperlink w:anchor="__RefHeading___Toc3399_1357861495">
+          <w:hyperlink w:anchor="__RefHeading___Toc3527_2610765929">
             <w:r>
               <w:rPr>
                 <w:webHidden/>
@@ -2029,7 +2029,7 @@
             <w:pStyle w:val="Contents1"/>
             <w:rPr/>
           </w:pPr>
-          <w:hyperlink w:anchor="__RefHeading___Toc3397_1357861495">
+          <w:hyperlink w:anchor="__RefHeading___Toc3525_2610765929">
             <w:r>
               <w:rPr>
                 <w:webHidden/>
@@ -2052,7 +2052,7 @@
             <w:pStyle w:val="Contents1"/>
             <w:rPr/>
           </w:pPr>
-          <w:hyperlink w:anchor="__RefHeading___Toc3395_1357861495">
+          <w:hyperlink w:anchor="__RefHeading___Toc3523_2610765929">
             <w:r>
               <w:rPr>
                 <w:webHidden/>
@@ -2075,7 +2075,7 @@
             <w:pStyle w:val="Contents1"/>
             <w:rPr/>
           </w:pPr>
-          <w:hyperlink w:anchor="__RefHeading___Toc3393_1357861495">
+          <w:hyperlink w:anchor="__RefHeading___Toc3521_2610765929">
             <w:r>
               <w:rPr>
                 <w:webHidden/>
@@ -2098,7 +2098,7 @@
             <w:pStyle w:val="Contents1"/>
             <w:rPr/>
           </w:pPr>
-          <w:hyperlink w:anchor="__RefHeading___Toc3391_1357861495">
+          <w:hyperlink w:anchor="__RefHeading___Toc3519_2610765929">
             <w:r>
               <w:rPr>
                 <w:webHidden/>
@@ -2121,7 +2121,7 @@
             <w:pStyle w:val="Contents1"/>
             <w:rPr/>
           </w:pPr>
-          <w:hyperlink w:anchor="__RefHeading___Toc3389_1357861495">
+          <w:hyperlink w:anchor="__RefHeading___Toc3517_2610765929">
             <w:r>
               <w:rPr>
                 <w:webHidden/>
@@ -2144,7 +2144,7 @@
             <w:pStyle w:val="Contents1"/>
             <w:rPr/>
           </w:pPr>
-          <w:hyperlink w:anchor="__RefHeading___Toc3387_1357861495">
+          <w:hyperlink w:anchor="__RefHeading___Toc3515_2610765929">
             <w:r>
               <w:rPr>
                 <w:webHidden/>
@@ -2167,7 +2167,7 @@
             <w:pStyle w:val="Contents1"/>
             <w:rPr/>
           </w:pPr>
-          <w:hyperlink w:anchor="__RefHeading___Toc3385_1357861495">
+          <w:hyperlink w:anchor="__RefHeading___Toc3513_2610765929">
             <w:r>
               <w:rPr>
                 <w:webHidden/>
@@ -2190,7 +2190,7 @@
             <w:pStyle w:val="Contents1"/>
             <w:rPr/>
           </w:pPr>
-          <w:hyperlink w:anchor="__RefHeading___Toc3383_1357861495">
+          <w:hyperlink w:anchor="__RefHeading___Toc3511_2610765929">
             <w:r>
               <w:rPr>
                 <w:webHidden/>
@@ -2213,7 +2213,7 @@
             <w:pStyle w:val="Contents1"/>
             <w:rPr/>
           </w:pPr>
-          <w:hyperlink w:anchor="__RefHeading___Toc3381_1357861495">
+          <w:hyperlink w:anchor="__RefHeading___Toc3509_2610765929">
             <w:r>
               <w:rPr>
                 <w:webHidden/>
@@ -2236,7 +2236,7 @@
             <w:pStyle w:val="Contents1"/>
             <w:rPr/>
           </w:pPr>
-          <w:hyperlink w:anchor="__RefHeading___Toc3379_1357861495">
+          <w:hyperlink w:anchor="__RefHeading___Toc3507_2610765929">
             <w:r>
               <w:rPr>
                 <w:webHidden/>
@@ -2289,7 +2289,7 @@
         <w:pStyle w:val="Heading1"/>
         <w:rPr/>
       </w:pPr>
-      <w:bookmarkStart w:id="0" w:name="__RefHeading___Toc3271_1357861495"/>
+      <w:bookmarkStart w:id="0" w:name="__RefHeading___Toc3399_2610765929"/>
       <w:bookmarkEnd w:id="0"/>
       <w:r>
         <w:rPr>
@@ -2307,7 +2307,7 @@
         <w:pStyle w:val="Heading2"/>
         <w:rPr/>
       </w:pPr>
-      <w:bookmarkStart w:id="1" w:name="__RefHeading___Toc3273_1357861495"/>
+      <w:bookmarkStart w:id="1" w:name="__RefHeading___Toc3401_2610765929"/>
       <w:bookmarkEnd w:id="1"/>
       <w:r>
         <w:rPr>
@@ -2357,7 +2357,7 @@
         <w:pStyle w:val="Heading2"/>
         <w:rPr/>
       </w:pPr>
-      <w:bookmarkStart w:id="2" w:name="__RefHeading___Toc3275_1357861495"/>
+      <w:bookmarkStart w:id="2" w:name="__RefHeading___Toc3403_2610765929"/>
       <w:bookmarkEnd w:id="2"/>
       <w:r>
         <w:rPr>
@@ -2462,7 +2462,7 @@
         <w:pStyle w:val="Heading2"/>
         <w:rPr/>
       </w:pPr>
-      <w:bookmarkStart w:id="3" w:name="__RefHeading___Toc3277_1357861495"/>
+      <w:bookmarkStart w:id="3" w:name="__RefHeading___Toc3405_2610765929"/>
       <w:bookmarkEnd w:id="3"/>
       <w:r>
         <w:rPr>
@@ -2852,7 +2852,7 @@
         <w:pStyle w:val="Heading1"/>
         <w:rPr/>
       </w:pPr>
-      <w:bookmarkStart w:id="4" w:name="__RefHeading___Toc3279_1357861495"/>
+      <w:bookmarkStart w:id="4" w:name="__RefHeading___Toc3407_2610765929"/>
       <w:bookmarkEnd w:id="4"/>
       <w:r>
         <w:rPr>
@@ -2870,7 +2870,7 @@
         <w:pStyle w:val="Heading2"/>
         <w:rPr/>
       </w:pPr>
-      <w:bookmarkStart w:id="5" w:name="__RefHeading___Toc3281_1357861495"/>
+      <w:bookmarkStart w:id="5" w:name="__RefHeading___Toc3409_2610765929"/>
       <w:bookmarkEnd w:id="5"/>
       <w:r>
         <w:rPr>
@@ -2938,7 +2938,7 @@
         <w:jc w:val="center"/>
         <w:rPr/>
       </w:pPr>
-      <w:bookmarkStart w:id="6" w:name="__RefHeading___Toc3377_1357861495"/>
+      <w:bookmarkStart w:id="6" w:name="__RefHeading___Toc3505_2610765929"/>
       <w:bookmarkEnd w:id="6"/>
       <w:r>
         <w:rPr>
@@ -3606,7 +3606,7 @@
         <w:pStyle w:val="Heading2"/>
         <w:rPr/>
       </w:pPr>
-      <w:bookmarkStart w:id="7" w:name="__RefHeading___Toc3283_1357861495"/>
+      <w:bookmarkStart w:id="7" w:name="__RefHeading___Toc3411_2610765929"/>
       <w:bookmarkEnd w:id="7"/>
       <w:r>
         <w:rPr>
@@ -3674,7 +3674,7 @@
         <w:jc w:val="center"/>
         <w:rPr/>
       </w:pPr>
-      <w:bookmarkStart w:id="8" w:name="__RefHeading___Toc3415_1357861495"/>
+      <w:bookmarkStart w:id="8" w:name="__RefHeading___Toc3543_2610765929"/>
       <w:bookmarkEnd w:id="8"/>
       <w:r>
         <w:rPr>
@@ -3691,7 +3691,7 @@
         <w:pStyle w:val="Heading2"/>
         <w:rPr/>
       </w:pPr>
-      <w:bookmarkStart w:id="9" w:name="__RefHeading___Toc3285_1357861495"/>
+      <w:bookmarkStart w:id="9" w:name="__RefHeading___Toc3413_2610765929"/>
       <w:bookmarkEnd w:id="9"/>
       <w:r>
         <w:rPr>
@@ -3785,7 +3785,7 @@
         <w:pStyle w:val="Heading1"/>
         <w:rPr/>
       </w:pPr>
-      <w:bookmarkStart w:id="10" w:name="__RefHeading___Toc3287_1357861495"/>
+      <w:bookmarkStart w:id="10" w:name="__RefHeading___Toc3415_2610765929"/>
       <w:bookmarkEnd w:id="10"/>
       <w:r>
         <w:rPr>
@@ -3803,7 +3803,7 @@
         <w:pStyle w:val="Heading2"/>
         <w:rPr/>
       </w:pPr>
-      <w:bookmarkStart w:id="11" w:name="__RefHeading___Toc3289_1357861495"/>
+      <w:bookmarkStart w:id="11" w:name="__RefHeading___Toc3417_2610765929"/>
       <w:bookmarkEnd w:id="11"/>
       <w:r>
         <w:rPr>
@@ -3871,7 +3871,7 @@
         <w:jc w:val="center"/>
         <w:rPr/>
       </w:pPr>
-      <w:bookmarkStart w:id="12" w:name="__RefHeading___Toc3413_1357861495"/>
+      <w:bookmarkStart w:id="12" w:name="__RefHeading___Toc3541_2610765929"/>
       <w:bookmarkEnd w:id="12"/>
       <w:r>
         <w:rPr>
@@ -3888,7 +3888,7 @@
         <w:pStyle w:val="Heading2"/>
         <w:rPr/>
       </w:pPr>
-      <w:bookmarkStart w:id="13" w:name="__RefHeading___Toc3291_1357861495"/>
+      <w:bookmarkStart w:id="13" w:name="__RefHeading___Toc3419_2610765929"/>
       <w:bookmarkEnd w:id="13"/>
       <w:r>
         <w:rPr>
@@ -3956,7 +3956,7 @@
         <w:pStyle w:val="Heading2"/>
         <w:rPr/>
       </w:pPr>
-      <w:bookmarkStart w:id="14" w:name="__RefHeading___Toc3293_1357861495"/>
+      <w:bookmarkStart w:id="14" w:name="__RefHeading___Toc3421_2610765929"/>
       <w:bookmarkEnd w:id="14"/>
       <w:r>
         <w:rPr>
@@ -5083,7 +5083,7 @@
         <w:pStyle w:val="Heading2"/>
         <w:rPr/>
       </w:pPr>
-      <w:bookmarkStart w:id="15" w:name="__RefHeading___Toc3295_1357861495"/>
+      <w:bookmarkStart w:id="15" w:name="__RefHeading___Toc3423_2610765929"/>
       <w:bookmarkEnd w:id="15"/>
       <w:r>
         <w:rPr>
@@ -5144,7 +5144,7 @@
         <w:pStyle w:val="Heading1"/>
         <w:rPr/>
       </w:pPr>
-      <w:bookmarkStart w:id="16" w:name="__RefHeading___Toc3297_1357861495"/>
+      <w:bookmarkStart w:id="16" w:name="__RefHeading___Toc3425_2610765929"/>
       <w:bookmarkEnd w:id="16"/>
       <w:r>
         <w:rPr>
@@ -5162,7 +5162,7 @@
         <w:pStyle w:val="Heading2"/>
         <w:rPr/>
       </w:pPr>
-      <w:bookmarkStart w:id="17" w:name="__RefHeading___Toc3299_1357861495"/>
+      <w:bookmarkStart w:id="17" w:name="__RefHeading___Toc3427_2610765929"/>
       <w:bookmarkEnd w:id="17"/>
       <w:r>
         <w:rPr>
@@ -5230,7 +5230,7 @@
         <w:jc w:val="center"/>
         <w:rPr/>
       </w:pPr>
-      <w:bookmarkStart w:id="18" w:name="__RefHeading___Toc3411_1357861495"/>
+      <w:bookmarkStart w:id="18" w:name="__RefHeading___Toc3539_2610765929"/>
       <w:bookmarkEnd w:id="18"/>
       <w:r>
         <w:rPr>
@@ -6724,7 +6724,7 @@
         <w:pStyle w:val="Heading2"/>
         <w:rPr/>
       </w:pPr>
-      <w:bookmarkStart w:id="19" w:name="__RefHeading___Toc3301_1357861495"/>
+      <w:bookmarkStart w:id="19" w:name="__RefHeading___Toc3429_2610765929"/>
       <w:bookmarkEnd w:id="19"/>
       <w:r>
         <w:rPr>
@@ -6893,7 +6893,7 @@
         <w:jc w:val="center"/>
         <w:rPr/>
       </w:pPr>
-      <w:bookmarkStart w:id="20" w:name="__RefHeading___Toc3409_1357861495"/>
+      <w:bookmarkStart w:id="20" w:name="__RefHeading___Toc3537_2610765929"/>
       <w:bookmarkEnd w:id="20"/>
       <w:r>
         <w:rPr>
@@ -7050,7 +7050,7 @@
         <w:pStyle w:val="Heading2"/>
         <w:rPr/>
       </w:pPr>
-      <w:bookmarkStart w:id="21" w:name="__RefHeading___Toc3303_1357861495"/>
+      <w:bookmarkStart w:id="21" w:name="__RefHeading___Toc3431_2610765929"/>
       <w:bookmarkEnd w:id="21"/>
       <w:r>
         <w:rPr>
@@ -7215,7 +7215,7 @@
         <w:jc w:val="center"/>
         <w:rPr/>
       </w:pPr>
-      <w:bookmarkStart w:id="22" w:name="__RefHeading___Toc3407_1357861495"/>
+      <w:bookmarkStart w:id="22" w:name="__RefHeading___Toc3535_2610765929"/>
       <w:bookmarkEnd w:id="22"/>
       <w:r>
         <w:rPr>
@@ -7282,7 +7282,7 @@
         <w:pStyle w:val="Heading2"/>
         <w:rPr/>
       </w:pPr>
-      <w:bookmarkStart w:id="23" w:name="__RefHeading___Toc3305_1357861495"/>
+      <w:bookmarkStart w:id="23" w:name="__RefHeading___Toc3433_2610765929"/>
       <w:bookmarkEnd w:id="23"/>
       <w:r>
         <w:rPr>
@@ -7350,7 +7350,7 @@
         <w:jc w:val="center"/>
         <w:rPr/>
       </w:pPr>
-      <w:bookmarkStart w:id="24" w:name="__RefHeading___Toc3405_1357861495"/>
+      <w:bookmarkStart w:id="24" w:name="__RefHeading___Toc3533_2610765929"/>
       <w:bookmarkEnd w:id="24"/>
       <w:r>
         <w:rPr>
@@ -7466,7 +7466,7 @@
         <w:pStyle w:val="Heading2"/>
         <w:rPr/>
       </w:pPr>
-      <w:bookmarkStart w:id="25" w:name="__RefHeading___Toc3307_1357861495"/>
+      <w:bookmarkStart w:id="25" w:name="__RefHeading___Toc3435_2610765929"/>
       <w:bookmarkEnd w:id="25"/>
       <w:r>
         <w:rPr>
@@ -7534,7 +7534,7 @@
         <w:jc w:val="center"/>
         <w:rPr/>
       </w:pPr>
-      <w:bookmarkStart w:id="26" w:name="__RefHeading___Toc3403_1357861495"/>
+      <w:bookmarkStart w:id="26" w:name="__RefHeading___Toc3531_2610765929"/>
       <w:bookmarkEnd w:id="26"/>
       <w:r>
         <w:rPr>
@@ -7719,7 +7719,7 @@
         <w:pStyle w:val="Heading2"/>
         <w:rPr/>
       </w:pPr>
-      <w:bookmarkStart w:id="27" w:name="__RefHeading___Toc3309_1357861495"/>
+      <w:bookmarkStart w:id="27" w:name="__RefHeading___Toc3437_2610765929"/>
       <w:bookmarkEnd w:id="27"/>
       <w:r>
         <w:rPr>
@@ -7787,7 +7787,7 @@
         <w:jc w:val="center"/>
         <w:rPr/>
       </w:pPr>
-      <w:bookmarkStart w:id="28" w:name="__RefHeading___Toc3401_1357861495"/>
+      <w:bookmarkStart w:id="28" w:name="__RefHeading___Toc3529_2610765929"/>
       <w:bookmarkEnd w:id="28"/>
       <w:r>
         <w:rPr>
@@ -7913,7 +7913,7 @@
         <w:pStyle w:val="Heading2"/>
         <w:rPr/>
       </w:pPr>
-      <w:bookmarkStart w:id="29" w:name="__RefHeading___Toc3311_1357861495"/>
+      <w:bookmarkStart w:id="29" w:name="__RefHeading___Toc3439_2610765929"/>
       <w:bookmarkEnd w:id="29"/>
       <w:r>
         <w:rPr>
@@ -7981,7 +7981,7 @@
         <w:jc w:val="center"/>
         <w:rPr/>
       </w:pPr>
-      <w:bookmarkStart w:id="30" w:name="__RefHeading___Toc3399_1357861495"/>
+      <w:bookmarkStart w:id="30" w:name="__RefHeading___Toc3527_2610765929"/>
       <w:bookmarkEnd w:id="30"/>
       <w:r>
         <w:rPr>
@@ -8182,7 +8182,7 @@
         <w:pStyle w:val="Heading2"/>
         <w:rPr/>
       </w:pPr>
-      <w:bookmarkStart w:id="31" w:name="__RefHeading___Toc3313_1357861495"/>
+      <w:bookmarkStart w:id="31" w:name="__RefHeading___Toc3441_2610765929"/>
       <w:bookmarkEnd w:id="31"/>
       <w:r>
         <w:rPr>
@@ -8293,7 +8293,7 @@
         <w:jc w:val="center"/>
         <w:rPr/>
       </w:pPr>
-      <w:bookmarkStart w:id="32" w:name="__RefHeading___Toc3397_1357861495"/>
+      <w:bookmarkStart w:id="32" w:name="__RefHeading___Toc3525_2610765929"/>
       <w:bookmarkEnd w:id="32"/>
       <w:r>
         <w:rPr>
@@ -8482,7 +8482,7 @@
         <w:pStyle w:val="Heading1"/>
         <w:rPr/>
       </w:pPr>
-      <w:bookmarkStart w:id="33" w:name="__RefHeading___Toc3315_1357861495"/>
+      <w:bookmarkStart w:id="33" w:name="__RefHeading___Toc3443_2610765929"/>
       <w:bookmarkEnd w:id="33"/>
       <w:r>
         <w:rPr>
@@ -8500,7 +8500,7 @@
         <w:pStyle w:val="Heading2"/>
         <w:rPr/>
       </w:pPr>
-      <w:bookmarkStart w:id="34" w:name="__RefHeading___Toc3317_1357861495"/>
+      <w:bookmarkStart w:id="34" w:name="__RefHeading___Toc3445_2610765929"/>
       <w:bookmarkEnd w:id="34"/>
       <w:r>
         <w:rPr>
@@ -8568,7 +8568,7 @@
         <w:jc w:val="center"/>
         <w:rPr/>
       </w:pPr>
-      <w:bookmarkStart w:id="35" w:name="__RefHeading___Toc3395_1357861495"/>
+      <w:bookmarkStart w:id="35" w:name="__RefHeading___Toc3523_2610765929"/>
       <w:bookmarkEnd w:id="35"/>
       <w:r>
         <w:rPr>
@@ -8585,7 +8585,7 @@
         <w:pStyle w:val="Heading2"/>
         <w:rPr/>
       </w:pPr>
-      <w:bookmarkStart w:id="36" w:name="__RefHeading___Toc3319_1357861495"/>
+      <w:bookmarkStart w:id="36" w:name="__RefHeading___Toc3447_2610765929"/>
       <w:bookmarkEnd w:id="36"/>
       <w:r>
         <w:rPr>
@@ -8722,7 +8722,7 @@
         <w:pStyle w:val="Heading2"/>
         <w:rPr/>
       </w:pPr>
-      <w:bookmarkStart w:id="37" w:name="__RefHeading___Toc3321_1357861495"/>
+      <w:bookmarkStart w:id="37" w:name="__RefHeading___Toc3449_2610765929"/>
       <w:bookmarkEnd w:id="37"/>
       <w:r>
         <w:rPr>
@@ -9555,7 +9555,7 @@
         <w:pStyle w:val="Heading2"/>
         <w:rPr/>
       </w:pPr>
-      <w:bookmarkStart w:id="38" w:name="__RefHeading___Toc3323_1357861495"/>
+      <w:bookmarkStart w:id="38" w:name="__RefHeading___Toc3451_2610765929"/>
       <w:bookmarkEnd w:id="38"/>
       <w:r>
         <w:rPr>
@@ -11095,7 +11095,7 @@
         <w:pStyle w:val="Heading1"/>
         <w:rPr/>
       </w:pPr>
-      <w:bookmarkStart w:id="39" w:name="__RefHeading___Toc3325_1357861495"/>
+      <w:bookmarkStart w:id="39" w:name="__RefHeading___Toc3453_2610765929"/>
       <w:bookmarkEnd w:id="39"/>
       <w:r>
         <w:rPr>
@@ -11113,7 +11113,7 @@
         <w:pStyle w:val="Heading2"/>
         <w:rPr/>
       </w:pPr>
-      <w:bookmarkStart w:id="40" w:name="__RefHeading___Toc3327_1357861495"/>
+      <w:bookmarkStart w:id="40" w:name="__RefHeading___Toc3455_2610765929"/>
       <w:bookmarkEnd w:id="40"/>
       <w:r>
         <w:rPr>
@@ -11181,7 +11181,7 @@
         <w:jc w:val="center"/>
         <w:rPr/>
       </w:pPr>
-      <w:bookmarkStart w:id="41" w:name="__RefHeading___Toc3393_1357861495"/>
+      <w:bookmarkStart w:id="41" w:name="__RefHeading___Toc3521_2610765929"/>
       <w:bookmarkEnd w:id="41"/>
       <w:r>
         <w:rPr>
@@ -12306,7 +12306,7 @@
         <w:pStyle w:val="Heading2"/>
         <w:rPr/>
       </w:pPr>
-      <w:bookmarkStart w:id="42" w:name="__RefHeading___Toc3329_1357861495"/>
+      <w:bookmarkStart w:id="42" w:name="__RefHeading___Toc3457_2610765929"/>
       <w:bookmarkEnd w:id="42"/>
       <w:r>
         <w:rPr>
@@ -12374,7 +12374,7 @@
         <w:jc w:val="center"/>
         <w:rPr/>
       </w:pPr>
-      <w:bookmarkStart w:id="43" w:name="__RefHeading___Toc3391_1357861495"/>
+      <w:bookmarkStart w:id="43" w:name="__RefHeading___Toc3519_2610765929"/>
       <w:bookmarkEnd w:id="43"/>
       <w:r>
         <w:rPr>
@@ -12752,7 +12752,7 @@
         <w:pStyle w:val="Heading1"/>
         <w:rPr/>
       </w:pPr>
-      <w:bookmarkStart w:id="44" w:name="__RefHeading___Toc3331_1357861495"/>
+      <w:bookmarkStart w:id="44" w:name="__RefHeading___Toc3459_2610765929"/>
       <w:bookmarkEnd w:id="44"/>
       <w:r>
         <w:rPr>
@@ -12770,7 +12770,7 @@
         <w:pStyle w:val="Heading2"/>
         <w:rPr/>
       </w:pPr>
-      <w:bookmarkStart w:id="45" w:name="__RefHeading___Toc3333_1357861495"/>
+      <w:bookmarkStart w:id="45" w:name="__RefHeading___Toc3461_2610765929"/>
       <w:bookmarkEnd w:id="45"/>
       <w:r>
         <w:rPr>
@@ -12838,7 +12838,7 @@
         <w:jc w:val="center"/>
         <w:rPr/>
       </w:pPr>
-      <w:bookmarkStart w:id="46" w:name="__RefHeading___Toc3389_1357861495"/>
+      <w:bookmarkStart w:id="46" w:name="__RefHeading___Toc3517_2610765929"/>
       <w:bookmarkEnd w:id="46"/>
       <w:r>
         <w:rPr>
@@ -12855,7 +12855,7 @@
         <w:pStyle w:val="Heading2"/>
         <w:rPr/>
       </w:pPr>
-      <w:bookmarkStart w:id="47" w:name="__RefHeading___Toc3335_1357861495"/>
+      <w:bookmarkStart w:id="47" w:name="__RefHeading___Toc3463_2610765929"/>
       <w:bookmarkEnd w:id="47"/>
       <w:r>
         <w:rPr>
@@ -12923,7 +12923,7 @@
         <w:jc w:val="center"/>
         <w:rPr/>
       </w:pPr>
-      <w:bookmarkStart w:id="48" w:name="__RefHeading___Toc3387_1357861495"/>
+      <w:bookmarkStart w:id="48" w:name="__RefHeading___Toc3515_2610765929"/>
       <w:bookmarkEnd w:id="48"/>
       <w:r>
         <w:rPr>
@@ -12940,7 +12940,7 @@
         <w:pStyle w:val="Heading2"/>
         <w:rPr/>
       </w:pPr>
-      <w:bookmarkStart w:id="49" w:name="__RefHeading___Toc3337_1357861495"/>
+      <w:bookmarkStart w:id="49" w:name="__RefHeading___Toc3465_2610765929"/>
       <w:bookmarkEnd w:id="49"/>
       <w:r>
         <w:rPr>
@@ -13008,7 +13008,7 @@
         <w:jc w:val="center"/>
         <w:rPr/>
       </w:pPr>
-      <w:bookmarkStart w:id="50" w:name="__RefHeading___Toc3385_1357861495"/>
+      <w:bookmarkStart w:id="50" w:name="__RefHeading___Toc3513_2610765929"/>
       <w:bookmarkEnd w:id="50"/>
       <w:r>
         <w:rPr>
@@ -13025,7 +13025,7 @@
         <w:pStyle w:val="Heading2"/>
         <w:rPr/>
       </w:pPr>
-      <w:bookmarkStart w:id="51" w:name="__RefHeading___Toc3339_1357861495"/>
+      <w:bookmarkStart w:id="51" w:name="__RefHeading___Toc3467_2610765929"/>
       <w:bookmarkEnd w:id="51"/>
       <w:r>
         <w:rPr>
@@ -13093,7 +13093,7 @@
         <w:jc w:val="center"/>
         <w:rPr/>
       </w:pPr>
-      <w:bookmarkStart w:id="52" w:name="__RefHeading___Toc3383_1357861495"/>
+      <w:bookmarkStart w:id="52" w:name="__RefHeading___Toc3511_2610765929"/>
       <w:bookmarkEnd w:id="52"/>
       <w:r>
         <w:rPr>
@@ -13110,7 +13110,7 @@
         <w:pStyle w:val="Heading2"/>
         <w:rPr/>
       </w:pPr>
-      <w:bookmarkStart w:id="53" w:name="__RefHeading___Toc3341_1357861495"/>
+      <w:bookmarkStart w:id="53" w:name="__RefHeading___Toc3469_2610765929"/>
       <w:bookmarkEnd w:id="53"/>
       <w:r>
         <w:rPr>
@@ -13178,7 +13178,7 @@
         <w:jc w:val="center"/>
         <w:rPr/>
       </w:pPr>
-      <w:bookmarkStart w:id="54" w:name="__RefHeading___Toc3381_1357861495"/>
+      <w:bookmarkStart w:id="54" w:name="__RefHeading___Toc3509_2610765929"/>
       <w:bookmarkEnd w:id="54"/>
       <w:r>
         <w:rPr>
@@ -13195,7 +13195,7 @@
         <w:pStyle w:val="Heading2"/>
         <w:rPr/>
       </w:pPr>
-      <w:bookmarkStart w:id="55" w:name="__RefHeading___Toc3343_1357861495"/>
+      <w:bookmarkStart w:id="55" w:name="__RefHeading___Toc3471_2610765929"/>
       <w:bookmarkEnd w:id="55"/>
       <w:r>
         <w:rPr>
@@ -13263,7 +13263,7 @@
         <w:jc w:val="center"/>
         <w:rPr/>
       </w:pPr>
-      <w:bookmarkStart w:id="56" w:name="__RefHeading___Toc3379_1357861495"/>
+      <w:bookmarkStart w:id="56" w:name="__RefHeading___Toc3507_2610765929"/>
       <w:bookmarkEnd w:id="56"/>
       <w:r>
         <w:rPr>
@@ -13280,7 +13280,7 @@
         <w:pStyle w:val="Heading2"/>
         <w:rPr/>
       </w:pPr>
-      <w:bookmarkStart w:id="57" w:name="__RefHeading___Toc3345_1357861495"/>
+      <w:bookmarkStart w:id="57" w:name="__RefHeading___Toc3473_2610765929"/>
       <w:bookmarkEnd w:id="57"/>
       <w:r>
         <w:rPr>
@@ -13394,7 +13394,7 @@
         <w:pStyle w:val="Heading1"/>
         <w:rPr/>
       </w:pPr>
-      <w:bookmarkStart w:id="58" w:name="__RefHeading___Toc3347_1357861495"/>
+      <w:bookmarkStart w:id="58" w:name="__RefHeading___Toc3475_2610765929"/>
       <w:bookmarkEnd w:id="58"/>
       <w:r>
         <w:rPr>
@@ -13404,7 +13404,7 @@
           <w:color w:val="000000"/>
           <w:sz w:val="32"/>
         </w:rPr>
-        <w:t>CHƯƠNG 8. THIẾT KẾ GIẢI THUẬT CHÍNH (MÃ GIẢ)</w:t>
+        <w:t>CHƯƠNG 8. THIẾT KẾ GIẢI THUẬT CHÍNH (MÃ GIẢ C++)</w:t>
       </w:r>
     </w:p>
     <w:p>
@@ -13412,7 +13412,7 @@
         <w:pStyle w:val="Heading2"/>
         <w:rPr/>
       </w:pPr>
-      <w:bookmarkStart w:id="59" w:name="__RefHeading___Toc3349_1357861495"/>
+      <w:bookmarkStart w:id="59" w:name="__RefHeading___Toc3477_2610765929"/>
       <w:bookmarkEnd w:id="59"/>
       <w:r>
         <w:rPr>
@@ -13444,74 +13444,104 @@
           <w:rFonts w:eastAsia="Courier New" w:cs="Courier New" w:ascii="Courier New" w:hAnsi="Courier New"/>
           <w:sz w:val="18"/>
         </w:rPr>
-        <w:t>Result BorrowService::checkConstraints(cmnd, isbn, today):</w:t>
-        <w:br/>
-        <w:t xml:space="preserve">        r = lib.readers.find(cmnd)</w:t>
+        <w:t>Result BorrowService::checkConstraints(const std::string&amp; cmnd, const std::string&amp; isbn, const Date&amp; today) {</w:t>
+        <w:br/>
+        <w:t xml:space="preserve">        Reader* r = lib.readers.find(cmnd);</w:t>
         <w:br/>
         <w:t xml:space="preserve">        // (a)</w:t>
         <w:br/>
-        <w:t xml:space="preserve">        if r == null                      -&gt; fail("Không tìm thấy độc giả")</w:t>
+        <w:t xml:space="preserve">        if (r == nullptr)                  return Result::fail("Không tìm thấy độc giả");</w:t>
         <w:br/>
         <w:t xml:space="preserve">        // (b)</w:t>
         <w:br/>
-        <w:t xml:space="preserve">        if r.status == LOCKED             -&gt; fail("Thẻ đang bị khóa")</w:t>
+        <w:t xml:space="preserve">        if (r-&gt;status == LOCKED)           return Result::fail("Thẻ đang bị khóa");</w:t>
         <w:br/>
         <w:t xml:space="preserve">        // (b)</w:t>
         <w:br/>
-        <w:t xml:space="preserve">        if today &gt; r.expDate              -&gt; fail("Thẻ hết hạn, cần gia hạn")</w:t>
-        <w:br/>
-        <w:t xml:space="preserve">        overdue = lib.tickets.countIf(t -&gt; t.cmnd == cmnd &amp;&amp; t.status == OVERDUE)</w:t>
+        <w:t xml:space="preserve">        if (today &gt; r-&gt;expDate)            return Result::fail("Thẻ hết hạn, cần gia hạn");</w:t>
+        <w:br/>
+        <w:t xml:space="preserve">        int overdue = lib.tickets.countIf([&amp;](const BorrowTicket&amp; t) {</w:t>
+        <w:br/>
+        <w:t xml:space="preserve">            return cmnd == t.cmnd &amp;&amp; t.status == OVERDUE; });</w:t>
         <w:br/>
         <w:t xml:space="preserve">        // (c)</w:t>
         <w:br/>
-        <w:t xml:space="preserve">        if overdue &gt; 0                    -&gt; fail("Đang có " + overdue + " phiếu quá hạn")</w:t>
-        <w:br/>
-        <w:t xml:space="preserve">        borrowing = lib.tickets.countIf(t -&gt; t.cmnd == cmnd &amp;&amp; t.status != RETURNED)</w:t>
+        <w:t xml:space="preserve">        if (overdue &gt; 0)                   return Result::fail("Đang có phiếu quá hạn");</w:t>
+        <w:br/>
+        <w:t xml:space="preserve">        int borrowing = lib.tickets.countIf([&amp;](const BorrowTicket&amp; t) {</w:t>
+        <w:br/>
+        <w:t xml:space="preserve">            return cmnd == t.cmnd &amp;&amp; t.status != RETURNED; });</w:t>
         <w:br/>
         <w:t xml:space="preserve">        // (d)</w:t>
         <w:br/>
-        <w:t xml:space="preserve">        if borrowing &gt;= config.maxBooks[r.cardType] -&gt; fail("Đã mượn tối đa ...")</w:t>
-        <w:br/>
-        <w:t xml:space="preserve">        b = lib.books.find(isbn)</w:t>
+        <w:t xml:space="preserve">        if (borrowing &gt;= config.maxBooks[r-&gt;cardType]) return Result::fail("Đã mượn tối đa");</w:t>
+        <w:br/>
+        <w:t xml:space="preserve">        Book* b = lib.books.find(isbn);</w:t>
         <w:br/>
         <w:t xml:space="preserve">        // (e)</w:t>
         <w:br/>
-        <w:t xml:space="preserve">        if b == null                      -&gt; fail("Không tìm thấy sách")</w:t>
+        <w:t xml:space="preserve">        if (b == nullptr)                  return Result::fail("Không tìm thấy sách");</w:t>
         <w:br/>
         <w:t xml:space="preserve">        // (e)</w:t>
         <w:br/>
-        <w:t xml:space="preserve">        if b.available &lt;= 0               -&gt; fail("Sách đã được mượn hết")</w:t>
-        <w:br/>
-        <w:t xml:space="preserve">        if lib.tickets.find(t -&gt; t.cmnd == cmnd &amp;&amp; t.isbn == isbn &amp;&amp; t.status != RETURNED)</w:t>
-        <w:br/>
-        <w:t xml:space="preserve">                                          // (f)</w:t>
-        <w:br/>
-        <w:t xml:space="preserve">                                          -&gt; fail("Độc giả đang mượn chính cuốn này")</w:t>
-        <w:br/>
-        <w:t xml:space="preserve">        return success()</w:t>
-        <w:br/>
-        <w:br/>
-        <w:t xml:space="preserve">    Result BorrowService::borrow(cmnd, isbn, date):</w:t>
-        <w:br/>
-        <w:t xml:space="preserve">        chk = checkConstraints(cmnd, isbn, date); if !chk.ok return chk</w:t>
-        <w:br/>
-        <w:t xml:space="preserve">        t.id = "PM" + pad5(lib.nextTicketNo++); t.cmnd, t.isbn</w:t>
-        <w:br/>
-        <w:t xml:space="preserve">        t.borrowDate = date; t.dueDate = date.addDays(config.loanDays[r.cardType])</w:t>
-        <w:br/>
-        <w:t xml:space="preserve">        t.status = BORROWING; t.fine = 0</w:t>
-        <w:br/>
-        <w:t xml:space="preserve">        b.available--                                   // sửa trực tiếp bản ghi trong AVL</w:t>
-        <w:br/>
-        <w:t xml:space="preserve">        lib.tickets.pushBack(t)</w:t>
-        <w:br/>
-        <w:t xml:space="preserve">        lib.history.pushBack(Transaction{BORROW, t.id, cmnd, isbn, date, 0})</w:t>
-        <w:br/>
-        <w:t xml:space="preserve">        lib.bookGraph: với mỗi sách s' độc giả này từng mượn: addEdge(idx(isbn), idx(s'), type=1, +1)</w:t>
-        <w:br/>
-        <w:t xml:space="preserve">        lib.markDirty(); logger.info(...)</w:t>
-        <w:br/>
-        <w:t xml:space="preserve">        return success("Lập phiếu " + t.id)</w:t>
+        <w:t xml:space="preserve">        if (b-&gt;available &lt;= 0)             return Result::fail("Sách đã được mượn hết");</w:t>
+        <w:br/>
+        <w:t xml:space="preserve">        BorrowTicket* dup = lib.tickets.find([&amp;](const BorrowTicket&amp; t) {</w:t>
+        <w:br/>
+        <w:t xml:space="preserve">            return cmnd == t.cmnd &amp;&amp; isbn == t.isbn &amp;&amp; t.status != RETURNED; });</w:t>
+        <w:br/>
+        <w:t xml:space="preserve">        // (f)</w:t>
+        <w:br/>
+        <w:t xml:space="preserve">        if (dup != nullptr)                return Result::fail("Độc giả đang mượn chính cuốn này");</w:t>
+        <w:br/>
+        <w:t xml:space="preserve">        return Result::success();</w:t>
+        <w:br/>
+        <w:t xml:space="preserve">    }</w:t>
+        <w:br/>
+        <w:br/>
+        <w:t xml:space="preserve">    Result BorrowService::borrow(const std::string&amp; cmnd, const std::string&amp; isbn, const Date&amp; date) {</w:t>
+        <w:br/>
+        <w:t xml:space="preserve">        Result chk = checkConstraints(cmnd, isbn, date);</w:t>
+        <w:br/>
+        <w:t xml:space="preserve">        if (!chk.ok) return chk;</w:t>
+        <w:br/>
+        <w:t xml:space="preserve">        Reader* r = lib.readers.find(cmnd);</w:t>
+        <w:br/>
+        <w:t xml:space="preserve">        Book*   b = lib.books.find(isbn);</w:t>
+        <w:br/>
+        <w:t xml:space="preserve">        BorrowTicket t;</w:t>
+        <w:br/>
+        <w:t xml:space="preserve">        makeTicketId(t.id, lib.nextTicketNo++);                    // "PM" + 5 chữ số</w:t>
+        <w:br/>
+        <w:t xml:space="preserve">        strncpy(t.cmnd, cmnd.c_str(), sizeof(t.cmnd) - 1);</w:t>
+        <w:br/>
+        <w:t xml:space="preserve">        strncpy(t.isbn, isbn.c_str(), sizeof(t.isbn) - 1);</w:t>
+        <w:br/>
+        <w:t xml:space="preserve">        t.borrowDate = date;</w:t>
+        <w:br/>
+        <w:t xml:space="preserve">        t.dueDate    = date.addDays(config.loanDays[r-&gt;cardType]);</w:t>
+        <w:br/>
+        <w:t xml:space="preserve">        t.status     = BORROWING;</w:t>
+        <w:br/>
+        <w:t xml:space="preserve">        t.fine       = 0;</w:t>
+        <w:br/>
+        <w:t xml:space="preserve">        // sửa trực tiếp bản ghi trong AVL</w:t>
+        <w:br/>
+        <w:t xml:space="preserve">        b-&gt;available--;</w:t>
+        <w:br/>
+        <w:t xml:space="preserve">        lib.tickets.pushBack(t);</w:t>
+        <w:br/>
+        <w:t xml:space="preserve">        lib.history.pushBack(Transaction::make(BORROW, t.id, cmnd, isbn, date, 0));</w:t>
+        <w:br/>
+        <w:t xml:space="preserve">        // cạnh type = 1 trong bookGraph</w:t>
+        <w:br/>
+        <w:t xml:space="preserve">        addHistoryEdges(cmnd, isbn);</w:t>
+        <w:br/>
+        <w:t xml:space="preserve">        lib.markDirty();</w:t>
+        <w:br/>
+        <w:t xml:space="preserve">        return Result::success(std::string("Lập phiếu ") + t.id);</w:t>
+        <w:br/>
+        <w:t xml:space="preserve">    }</w:t>
       </w:r>
     </w:p>
     <w:p>
@@ -13519,7 +13549,7 @@
         <w:pStyle w:val="Heading2"/>
         <w:rPr/>
       </w:pPr>
-      <w:bookmarkStart w:id="60" w:name="__RefHeading___Toc3351_1357861495"/>
+      <w:bookmarkStart w:id="60" w:name="__RefHeading___Toc3479_2610765929"/>
       <w:bookmarkEnd w:id="60"/>
       <w:r>
         <w:rPr>
@@ -13551,33 +13581,55 @@
           <w:rFonts w:eastAsia="Courier New" w:cs="Courier New" w:ascii="Courier New" w:hAnsi="Courier New"/>
           <w:sz w:val="18"/>
         </w:rPr>
-        <w:t>long BorrowService::calcFine(ticket, returnDate):</w:t>
-        <w:br/>
-        <w:t xml:space="preserve">        late = Date::daysBetween(ticket.dueDate, returnDate)</w:t>
-        <w:br/>
-        <w:t xml:space="preserve">        return late &gt; 0 ? late * config.finePerDay : 0</w:t>
-        <w:br/>
-        <w:br/>
-        <w:t xml:space="preserve">    Result BorrowService::returnBook(ticketId, returnDate):</w:t>
-        <w:br/>
-        <w:t xml:space="preserve">        t = lib.tickets.find(x -&gt; x.id == ticketId)</w:t>
-        <w:br/>
-        <w:t xml:space="preserve">        if t == null || t.status == RETURNED -&gt; fail("Phiếu không hợp lệ hoặc đã trả")</w:t>
-        <w:br/>
-        <w:t xml:space="preserve">        t.fine = calcFine(*t, returnDate); t.returnDate = returnDate; t.status = RETURNED</w:t>
-        <w:br/>
-        <w:t xml:space="preserve">        lib.books.find(t.isbn).available++</w:t>
-        <w:br/>
-        <w:t xml:space="preserve">        lib.history.pushBack({RETURN, ...}); if t.fine &gt; 0: lib.history.pushBack({FINE, ..., amount = t.fine})</w:t>
-        <w:br/>
-        <w:t xml:space="preserve">        lib.markDirty(); return success(t.fine &gt; 0 ? "Trả trễ, phạt " + t.fine + " đ" : "Trả đúng hạn")</w:t>
-        <w:br/>
-        <w:br/>
-        <w:t xml:space="preserve">    // gọi khi khởi động và mỗi lần vào menu mượn–trả</w:t>
-        <w:br/>
-        <w:t xml:space="preserve">    void BorrowService::refreshOverdue(today):</w:t>
-        <w:br/>
-        <w:t xml:space="preserve">        lib.tickets.forEach(t -&gt; if t.status == BORROWING &amp;&amp; today &gt; t.dueDate: t.status = OVERDUE)</w:t>
+        <w:t>long BorrowService::calcFine(const BorrowTicket&amp; t, const Date&amp; returnDate) const {</w:t>
+        <w:br/>
+        <w:t xml:space="preserve">        int late = Date::daysBetween(t.dueDate, returnDate);</w:t>
+        <w:br/>
+        <w:t xml:space="preserve">        return late &gt; 0 ? late * config.finePerDay : 0;</w:t>
+        <w:br/>
+        <w:t xml:space="preserve">    }</w:t>
+        <w:br/>
+        <w:br/>
+        <w:t xml:space="preserve">    Result BorrowService::returnBook(const std::string&amp; ticketId, const Date&amp; returnDate) {</w:t>
+        <w:br/>
+        <w:t xml:space="preserve">        BorrowTicket* t = lib.tickets.find([&amp;](const BorrowTicket&amp; x) { return ticketId == x.id; });</w:t>
+        <w:br/>
+        <w:t xml:space="preserve">        if (t == nullptr || t-&gt;status == RETURNED)</w:t>
+        <w:br/>
+        <w:t xml:space="preserve">            return Result::fail("Phiếu không hợp lệ hoặc đã trả");</w:t>
+        <w:br/>
+        <w:t xml:space="preserve">        t-&gt;fine       = calcFine(*t, returnDate);</w:t>
+        <w:br/>
+        <w:t xml:space="preserve">        t-&gt;returnDate = returnDate;</w:t>
+        <w:br/>
+        <w:t xml:space="preserve">        t-&gt;status     = RETURNED;</w:t>
+        <w:br/>
+        <w:t xml:space="preserve">        lib.books.find(t-&gt;isbn)-&gt;available++;</w:t>
+        <w:br/>
+        <w:t xml:space="preserve">        lib.history.pushBack(Transaction::make(RETURN, t-&gt;id, t-&gt;cmnd, t-&gt;isbn, returnDate, 0));</w:t>
+        <w:br/>
+        <w:t xml:space="preserve">        if (t-&gt;fine &gt; 0)</w:t>
+        <w:br/>
+        <w:t xml:space="preserve">            lib.history.pushBack(Transaction::make(FINE, t-&gt;id, t-&gt;cmnd, t-&gt;isbn, returnDate, t-&gt;fine));</w:t>
+        <w:br/>
+        <w:t xml:space="preserve">        lib.markDirty();</w:t>
+        <w:br/>
+        <w:t xml:space="preserve">        return Result::success(t-&gt;fine &gt; 0 ? "Trả trễ, có tiền phạt" : "Trả đúng hạn");</w:t>
+        <w:br/>
+        <w:t xml:space="preserve">    }</w:t>
+        <w:br/>
+        <w:br/>
+        <w:t xml:space="preserve">    // gọi khi khởi động và mỗi lần vào menu mượn – trả</w:t>
+        <w:br/>
+        <w:t xml:space="preserve">    void BorrowService::refreshOverdue(const Date&amp; today) {</w:t>
+        <w:br/>
+        <w:t xml:space="preserve">        lib.tickets.forEach([&amp;](BorrowTicket&amp; t) {</w:t>
+        <w:br/>
+        <w:t xml:space="preserve">            if (t.status == BORROWING &amp;&amp; today &gt; t.dueDate) t.status = OVERDUE;</w:t>
+        <w:br/>
+        <w:t xml:space="preserve">        });</w:t>
+        <w:br/>
+        <w:t xml:space="preserve">    }</w:t>
       </w:r>
     </w:p>
     <w:p>
@@ -13585,7 +13637,7 @@
         <w:pStyle w:val="Heading2"/>
         <w:rPr/>
       </w:pPr>
-      <w:bookmarkStart w:id="61" w:name="__RefHeading___Toc3353_1357861495"/>
+      <w:bookmarkStart w:id="61" w:name="__RefHeading___Toc3481_2610765929"/>
       <w:bookmarkEnd w:id="61"/>
       <w:r>
         <w:rPr>
@@ -13617,23 +13669,37 @@
           <w:rFonts w:eastAsia="Courier New" w:cs="Courier New" w:ascii="Courier New" w:hAnsi="Courier New"/>
           <w:sz w:val="18"/>
         </w:rPr>
-        <w:t>DynamicArray&lt;Pair&gt; StatisticsService::top10Books(from, to):</w:t>
-        <w:br/>
-        <w:t xml:space="preserve">        HashTable&lt;string,int&gt; cnt(2003)</w:t>
-        <w:br/>
-        <w:t xml:space="preserve">        // O(T)</w:t>
-        <w:br/>
-        <w:t xml:space="preserve">        for each tr in lib.history: if tr.type == BORROW &amp;&amp; from &lt;= tr.date &lt;= to: cnt[tr.isbn]++</w:t>
-        <w:br/>
-        <w:t xml:space="preserve">        // DynamicArray&lt;Pair{isbn, count}&gt;</w:t>
-        <w:br/>
-        <w:t xml:space="preserve">        arr = cnt.toArray()</w:t>
-        <w:br/>
-        <w:t xml:space="preserve">        // merge sort O(k log k), k = số sách có lượt mượn</w:t>
-        <w:br/>
-        <w:t xml:space="preserve">        arr.sort((a,b) -&gt; a.count &gt; b.count)</w:t>
-        <w:br/>
-        <w:t xml:space="preserve">        return arr.first(10)                                // kèm tên sách tra từ AVL</w:t>
+        <w:t>DynamicArray&lt;Pair&gt; StatisticsService::top10Books(const Date&amp; from, const Date&amp; to) {</w:t>
+        <w:br/>
+        <w:t xml:space="preserve">        HashTable&lt;std::string, int&gt; cnt(2003);</w:t>
+        <w:br/>
+        <w:t xml:space="preserve">        for (int i = 0; i &lt; lib.history.size(); ++i) {                       // O(T)</w:t>
+        <w:br/>
+        <w:t xml:space="preserve">            const Transaction&amp; tr = lib.history.at(i);</w:t>
+        <w:br/>
+        <w:t xml:space="preserve">            if (tr.type == BORROW &amp;&amp; !(tr.date &lt; from) &amp;&amp; !(to &lt; tr.date)) {</w:t>
+        <w:br/>
+        <w:t xml:space="preserve">                int* c = cnt.find(tr.isbn);</w:t>
+        <w:br/>
+        <w:t xml:space="preserve">                if (c != nullptr) (*c)++; else cnt.insert(tr.isbn, 1);</w:t>
+        <w:br/>
+        <w:t xml:space="preserve">            }</w:t>
+        <w:br/>
+        <w:t xml:space="preserve">        }</w:t>
+        <w:br/>
+        <w:t xml:space="preserve">        // Pair{isbn, count}</w:t>
+        <w:br/>
+        <w:t xml:space="preserve">        DynamicArray&lt;Pair&gt; arr = cnt.toArray();</w:t>
+        <w:br/>
+        <w:t xml:space="preserve">        // merge sort O(k log k)</w:t>
+        <w:br/>
+        <w:t xml:space="preserve">        arr.sort([](const Pair&amp; a, const Pair&amp; b) { return a.count &gt; b.count; });</w:t>
+        <w:br/>
+        <w:t xml:space="preserve">        // kèm tên sách tra từ AVL</w:t>
+        <w:br/>
+        <w:t xml:space="preserve">        return arr.first(10);</w:t>
+        <w:br/>
+        <w:t xml:space="preserve">    }</w:t>
       </w:r>
     </w:p>
     <w:p>
@@ -13641,7 +13707,7 @@
         <w:pStyle w:val="Heading2"/>
         <w:rPr/>
       </w:pPr>
-      <w:bookmarkStart w:id="62" w:name="__RefHeading___Toc3355_1357861495"/>
+      <w:bookmarkStart w:id="62" w:name="__RefHeading___Toc3483_2610765929"/>
       <w:bookmarkEnd w:id="62"/>
       <w:r>
         <w:rPr>
@@ -13673,28 +13739,58 @@
           <w:rFonts w:eastAsia="Courier New" w:cs="Courier New" w:ascii="Courier New" w:hAnsi="Courier New"/>
           <w:sz w:val="18"/>
         </w:rPr>
-        <w:t>DynamicArray&lt;int&gt; Graph::bfs(s, maxDepth, type):</w:t>
-        <w:br/>
-        <w:t xml:space="preserve">        visited[0..n) = false; dist[s] = 0; queue.push(s); visited[s] = true</w:t>
-        <w:br/>
-        <w:t xml:space="preserve">        while queue not empty:</w:t>
-        <w:br/>
-        <w:t xml:space="preserve">            u = queue.pop()</w:t>
-        <w:br/>
-        <w:t xml:space="preserve">            if dist[u] == maxDepth: continue</w:t>
-        <w:br/>
-        <w:t xml:space="preserve">            for e in adj[u]: if e.type == type &amp;&amp; !visited[e.to]:</w:t>
-        <w:br/>
-        <w:t xml:space="preserve">                visited[e.to] = true; dist[e.to] = dist[u] + 1; queue.push(e.to); result.push(e.to)</w:t>
-        <w:br/>
-        <w:t xml:space="preserve">        return result                                       // O(V + E)</w:t>
-        <w:br/>
-        <w:br/>
-        <w:t xml:space="preserve">    RecommendService::sameCategory(isbn):</w:t>
-        <w:br/>
-        <w:t xml:space="preserve">        u = idx(isbn); cand = lib.bookGraph.bfs(u, 2, 0)</w:t>
-        <w:br/>
-        <w:t xml:space="preserve">        lọc cand: available &gt; 0; sắp theo lượt mượn giảm dần (đếm từ history); lấy 10</w:t>
+        <w:t>DynamicArray&lt;int&gt; Graph::bfs(int s, int maxDepth, int type) {               // O(V + E)</w:t>
+        <w:br/>
+        <w:t xml:space="preserve">        DynamicArray&lt;int&gt; result;</w:t>
+        <w:br/>
+        <w:t xml:space="preserve">        bool* visited = new bool[n]();</w:t>
+        <w:br/>
+        <w:t xml:space="preserve">        int*  dist    = new int[n]();</w:t>
+        <w:br/>
+        <w:t xml:space="preserve">        LinkedList&lt;int&gt; queue;</w:t>
+        <w:br/>
+        <w:t xml:space="preserve">        queue.pushBack(s); visited[s] = true; dist[s] = 0;</w:t>
+        <w:br/>
+        <w:t xml:space="preserve">        while (queue.size() &gt; 0) {</w:t>
+        <w:br/>
+        <w:t xml:space="preserve">            int u = queue.popFront();</w:t>
+        <w:br/>
+        <w:t xml:space="preserve">            if (dist[u] == maxDepth) continue;</w:t>
+        <w:br/>
+        <w:t xml:space="preserve">            for (int i = 0; i &lt; adj[u].size(); ++i) {</w:t>
+        <w:br/>
+        <w:t xml:space="preserve">                const Edge&amp; e = adj[u].at(i);</w:t>
+        <w:br/>
+        <w:t xml:space="preserve">                if (e.type == type &amp;&amp; !visited[e.to]) {</w:t>
+        <w:br/>
+        <w:t xml:space="preserve">                    visited[e.to] = true; dist[e.to] = dist[u] + 1;</w:t>
+        <w:br/>
+        <w:t xml:space="preserve">                    queue.pushBack(e.to); result.pushBack(e.to);</w:t>
+        <w:br/>
+        <w:t xml:space="preserve">                }</w:t>
+        <w:br/>
+        <w:t xml:space="preserve">            }</w:t>
+        <w:br/>
+        <w:t xml:space="preserve">        }</w:t>
+        <w:br/>
+        <w:t xml:space="preserve">        delete[] visited; delete[] dist;</w:t>
+        <w:br/>
+        <w:t xml:space="preserve">        return result;</w:t>
+        <w:br/>
+        <w:t xml:space="preserve">    }</w:t>
+        <w:br/>
+        <w:br/>
+        <w:t xml:space="preserve">    DynamicArray&lt;int&gt; RecommendService::sameCategory(const std::string&amp; isbn) {</w:t>
+        <w:br/>
+        <w:t xml:space="preserve">        int u = indexOf(isbn);</w:t>
+        <w:br/>
+        <w:t xml:space="preserve">        DynamicArray&lt;int&gt; cand = lib.bookGraph.bfs(u, 2, 0);</w:t>
+        <w:br/>
+        <w:t xml:space="preserve">        // lọc sách còn available &gt; 0, sắp theo lượt mượn giảm dần (đếm từ history), lấy 10</w:t>
+        <w:br/>
+        <w:t xml:space="preserve">        return topAvailable(cand, 10);</w:t>
+        <w:br/>
+        <w:t xml:space="preserve">    }</w:t>
       </w:r>
     </w:p>
     <w:p>
@@ -13702,7 +13798,7 @@
         <w:pStyle w:val="Heading2"/>
         <w:rPr/>
       </w:pPr>
-      <w:bookmarkStart w:id="63" w:name="__RefHeading___Toc3357_1357861495"/>
+      <w:bookmarkStart w:id="63" w:name="__RefHeading___Toc3485_2610765929"/>
       <w:bookmarkEnd w:id="63"/>
       <w:r>
         <w:rPr>
@@ -13734,24 +13830,54 @@
           <w:rFonts w:eastAsia="Courier New" w:cs="Courier New" w:ascii="Courier New" w:hAnsi="Courier New"/>
           <w:sz w:val="18"/>
         </w:rPr>
-        <w:t>DynamicArray&lt;string&gt; Trie::startsWith(prefix, limit):</w:t>
-        <w:br/>
-        <w:t xml:space="preserve">        p = normalize(prefix); node = root</w:t>
-        <w:br/>
-        <w:t xml:space="preserve">        for c in p: i = charIndex(c); if i &lt; 0 continue; if node.children[i] == null return {}; node = node.children[i]</w:t>
-        <w:br/>
-        <w:t xml:space="preserve">        // DFS cây con, dừng khi đủ limit</w:t>
-        <w:br/>
-        <w:t xml:space="preserve">        collect(node, p, out, limit); return out</w:t>
-        <w:br/>
-        <w:br/>
-        <w:t xml:space="preserve">    Trie::collect(node, cur, out, limit):</w:t>
-        <w:br/>
-        <w:t xml:space="preserve">        if out.size() &gt;= limit return</w:t>
-        <w:br/>
-        <w:t xml:space="preserve">        if node.isEnd: out.push(cur)</w:t>
-        <w:br/>
-        <w:t xml:space="preserve">        for i in 0..36: if node.children[i]: collect(node.children[i], cur + charOf(i), out, limit)</w:t>
+        <w:t>DynamicArray&lt;std::string&gt; Trie::startsWith(const std::string&amp; prefix, int limit) {</w:t>
+        <w:br/>
+        <w:t xml:space="preserve">        DynamicArray&lt;std::string&gt; out;</w:t>
+        <w:br/>
+        <w:t xml:space="preserve">        std::string p = Utils::normalize(prefix);</w:t>
+        <w:br/>
+        <w:t xml:space="preserve">        TrieNode* node = root;</w:t>
+        <w:br/>
+        <w:t xml:space="preserve">        for (size_t k = 0; k &lt; p.size(); ++k) {</w:t>
+        <w:br/>
+        <w:t xml:space="preserve">            int i = charIndex(p[k]);</w:t>
+        <w:br/>
+        <w:t xml:space="preserve">            if (i &lt; 0) continue;</w:t>
+        <w:br/>
+        <w:t xml:space="preserve">            if (node-&gt;children[i] == nullptr) return out;</w:t>
+        <w:br/>
+        <w:t xml:space="preserve">            node = node-&gt;children[i];</w:t>
+        <w:br/>
+        <w:t xml:space="preserve">        }</w:t>
+        <w:br/>
+        <w:t xml:space="preserve">        collect(node, p, out, limit);                                       // DFS cây con</w:t>
+        <w:br/>
+        <w:t xml:space="preserve">        return out;</w:t>
+        <w:br/>
+        <w:t xml:space="preserve">    }</w:t>
+        <w:br/>
+        <w:br/>
+        <w:t xml:space="preserve">    void Trie::collect(TrieNode* node, std::string&amp; cur, DynamicArray&lt;std::string&gt;&amp; out, int limit) {</w:t>
+        <w:br/>
+        <w:t xml:space="preserve">        if (out.size() &gt;= limit) return;</w:t>
+        <w:br/>
+        <w:t xml:space="preserve">        if (node-&gt;isEnd) out.pushBack(cur);</w:t>
+        <w:br/>
+        <w:t xml:space="preserve">        for (int i = 0; i &lt; ALPHABET; ++i) {</w:t>
+        <w:br/>
+        <w:t xml:space="preserve">            if (node-&gt;children[i] != nullptr) {</w:t>
+        <w:br/>
+        <w:t xml:space="preserve">                cur.push_back(charOf(i));</w:t>
+        <w:br/>
+        <w:t xml:space="preserve">                collect(node-&gt;children[i], cur, out, limit);</w:t>
+        <w:br/>
+        <w:t xml:space="preserve">                cur.pop_back();</w:t>
+        <w:br/>
+        <w:t xml:space="preserve">            }</w:t>
+        <w:br/>
+        <w:t xml:space="preserve">        }</w:t>
+        <w:br/>
+        <w:t xml:space="preserve">    }</w:t>
       </w:r>
     </w:p>
     <w:p>
@@ -13759,7 +13885,7 @@
         <w:pStyle w:val="Heading2"/>
         <w:rPr/>
       </w:pPr>
-      <w:bookmarkStart w:id="64" w:name="__RefHeading___Toc3359_1357861495"/>
+      <w:bookmarkStart w:id="64" w:name="__RefHeading___Toc3487_2610765929"/>
       <w:bookmarkEnd w:id="64"/>
       <w:r>
         <w:rPr>
@@ -13791,7 +13917,7 @@
           <w:rFonts w:eastAsia="Courier New" w:cs="Courier New" w:ascii="Courier New" w:hAnsi="Courier New"/>
           <w:sz w:val="18"/>
         </w:rPr>
-        <w:t>string Utils::normalize(s):</w:t>
+        <w:t>std::string Utils::normalize(const std::string&amp; s) {</w:t>
         <w:br/>
         <w:t xml:space="preserve">      // 1. chuyển UTF-8 về mã điểm (code point); 2. ánh xạ bảng 134 ký tự có dấu -&gt; không dấu (à á ạ ả ã â ... -&gt; a, đ -&gt; d)</w:t>
         <w:br/>
@@ -13799,6 +13925,8 @@
         <w:t xml:space="preserve">        // 3. chữ thường; 4. giữ a-z, 0-9, khoảng trắng; gộp nhiều khoảng trắng; cắt hai đầu</w:t>
         <w:br/>
         <w:t xml:space="preserve">        // Ví dụ: "Lập Trình  C++ Căn Bản" -&gt; "lap trinh c can ban"</w:t>
+        <w:br/>
+        <w:t xml:space="preserve">    }</w:t>
       </w:r>
     </w:p>
     <w:p>
@@ -13806,7 +13934,7 @@
         <w:pStyle w:val="Heading1"/>
         <w:rPr/>
       </w:pPr>
-      <w:bookmarkStart w:id="65" w:name="__RefHeading___Toc3361_1357861495"/>
+      <w:bookmarkStart w:id="65" w:name="__RefHeading___Toc3489_2610765929"/>
       <w:bookmarkEnd w:id="65"/>
       <w:r>
         <w:rPr>
@@ -13824,7 +13952,7 @@
         <w:pStyle w:val="Heading2"/>
         <w:rPr/>
       </w:pPr>
-      <w:bookmarkStart w:id="66" w:name="__RefHeading___Toc3363_1357861495"/>
+      <w:bookmarkStart w:id="66" w:name="__RefHeading___Toc3491_2610765929"/>
       <w:bookmarkEnd w:id="66"/>
       <w:r>
         <w:rPr>
@@ -14901,7 +15029,7 @@
         <w:pStyle w:val="Heading2"/>
         <w:rPr/>
       </w:pPr>
-      <w:bookmarkStart w:id="67" w:name="__RefHeading___Toc3365_1357861495"/>
+      <w:bookmarkStart w:id="67" w:name="__RefHeading___Toc3493_2610765929"/>
       <w:bookmarkEnd w:id="67"/>
       <w:r>
         <w:rPr>
@@ -16548,7 +16676,7 @@
         <w:pStyle w:val="Heading1"/>
         <w:rPr/>
       </w:pPr>
-      <w:bookmarkStart w:id="68" w:name="__RefHeading___Toc3367_1357861495"/>
+      <w:bookmarkStart w:id="68" w:name="__RefHeading___Toc3495_2610765929"/>
       <w:bookmarkEnd w:id="68"/>
       <w:r>
         <w:rPr>
@@ -17635,7 +17763,7 @@
         <w:pStyle w:val="Heading2"/>
         <w:rPr/>
       </w:pPr>
-      <w:bookmarkStart w:id="69" w:name="__RefHeading___Toc3369_1357861495"/>
+      <w:bookmarkStart w:id="69" w:name="__RefHeading___Toc3497_2610765929"/>
       <w:bookmarkEnd w:id="69"/>
       <w:r>
         <w:rPr>
@@ -17773,7 +17901,7 @@
         <w:pStyle w:val="Heading1"/>
         <w:rPr/>
       </w:pPr>
-      <w:bookmarkStart w:id="70" w:name="__RefHeading___Toc3371_1357861495"/>
+      <w:bookmarkStart w:id="70" w:name="__RefHeading___Toc3499_2610765929"/>
       <w:bookmarkEnd w:id="70"/>
       <w:r>
         <w:rPr>
@@ -17791,7 +17919,7 @@
         <w:pStyle w:val="Heading2"/>
         <w:rPr/>
       </w:pPr>
-      <w:bookmarkStart w:id="71" w:name="__RefHeading___Toc3373_1357861495"/>
+      <w:bookmarkStart w:id="71" w:name="__RefHeading___Toc3501_2610765929"/>
       <w:bookmarkEnd w:id="71"/>
       <w:r>
         <w:rPr>
@@ -18820,7 +18948,7 @@
         <w:pStyle w:val="Heading2"/>
         <w:rPr/>
       </w:pPr>
-      <w:bookmarkStart w:id="72" w:name="__RefHeading___Toc3375_1357861495"/>
+      <w:bookmarkStart w:id="72" w:name="__RefHeading___Toc3503_2610765929"/>
       <w:bookmarkEnd w:id="72"/>
       <w:r>
         <w:rPr>
@@ -19097,7 +19225,7 @@
         <w:sz w:val="20"/>
         <w:rFonts w:eastAsia="Times New Roman" w:cs="Times New Roman"/>
       </w:rPr>
-      <w:t>36</w:t>
+      <w:t>37</w:t>
     </w:r>
     <w:r>
       <w:rPr>

</xml_diff>